<commit_message>
debugged for case 2008
</commit_message>
<xml_diff>
--- a/Test Cases.docx
+++ b/Test Cases.docx
@@ -1739,6 +1739,53 @@
               </w:rPr>
             </w:pPr>
           </w:p>
+          <w:p>
+            <w:pPr>
+              <w:rPr>
+                <w:b/>
+                <w:bCs/>
+              </w:rPr>
+            </w:pPr>
+          </w:p>
+          <w:p>
+            <w:pPr>
+              <w:rPr>
+                <w:b/>
+                <w:bCs/>
+              </w:rPr>
+            </w:pPr>
+          </w:p>
+          <w:p>
+            <w:pPr>
+              <w:rPr>
+                <w:b/>
+                <w:bCs/>
+              </w:rPr>
+            </w:pPr>
+          </w:p>
+          <w:p>
+            <w:pPr>
+              <w:rPr>
+                <w:b/>
+                <w:bCs/>
+              </w:rPr>
+            </w:pPr>
+          </w:p>
+          <w:p>
+            <w:pPr>
+              <w:rPr>
+                <w:b/>
+                <w:bCs/>
+              </w:rPr>
+            </w:pPr>
+            <w:r>
+              <w:rPr>
+                <w:b/>
+                <w:bCs/>
+              </w:rPr>
+              <w:t>Pass</w:t>
+            </w:r>
+          </w:p>
         </w:tc>
       </w:tr>
       <w:tr>
@@ -2335,7 +2382,15 @@
               <w:pStyle w:val="ListParagraph"/>
             </w:pPr>
             <w:r>
-              <w:t xml:space="preserve">(replace the parameters by appropriate values). </w:t>
+              <w:t>(</w:t>
+            </w:r>
+            <w:proofErr w:type="gramStart"/>
+            <w:r>
+              <w:t>replace</w:t>
+            </w:r>
+            <w:proofErr w:type="gramEnd"/>
+            <w:r>
+              <w:t xml:space="preserve"> the parameters by appropriate values). </w:t>
             </w:r>
           </w:p>
           <w:p>

</xml_diff>

<commit_message>
tests 9 to 11
</commit_message>
<xml_diff>
--- a/Test Cases.docx
+++ b/Test Cases.docx
@@ -1951,6 +1951,53 @@
               </w:rPr>
             </w:pPr>
           </w:p>
+          <w:p>
+            <w:pPr>
+              <w:rPr>
+                <w:b/>
+                <w:bCs/>
+              </w:rPr>
+            </w:pPr>
+          </w:p>
+          <w:p>
+            <w:pPr>
+              <w:rPr>
+                <w:b/>
+                <w:bCs/>
+              </w:rPr>
+            </w:pPr>
+          </w:p>
+          <w:p>
+            <w:pPr>
+              <w:rPr>
+                <w:b/>
+                <w:bCs/>
+              </w:rPr>
+            </w:pPr>
+          </w:p>
+          <w:p>
+            <w:pPr>
+              <w:rPr>
+                <w:b/>
+                <w:bCs/>
+              </w:rPr>
+            </w:pPr>
+          </w:p>
+          <w:p>
+            <w:pPr>
+              <w:rPr>
+                <w:b/>
+                <w:bCs/>
+              </w:rPr>
+            </w:pPr>
+            <w:r>
+              <w:rPr>
+                <w:b/>
+                <w:bCs/>
+              </w:rPr>
+              <w:t>Pass</w:t>
+            </w:r>
+          </w:p>
         </w:tc>
       </w:tr>
       <w:tr>
@@ -2065,6 +2112,45 @@
               </w:rPr>
             </w:pPr>
           </w:p>
+          <w:p>
+            <w:pPr>
+              <w:rPr>
+                <w:b/>
+                <w:bCs/>
+              </w:rPr>
+            </w:pPr>
+          </w:p>
+          <w:p>
+            <w:pPr>
+              <w:rPr>
+                <w:b/>
+                <w:bCs/>
+              </w:rPr>
+            </w:pPr>
+          </w:p>
+          <w:p>
+            <w:pPr>
+              <w:rPr>
+                <w:b/>
+                <w:bCs/>
+              </w:rPr>
+            </w:pPr>
+          </w:p>
+          <w:p>
+            <w:pPr>
+              <w:rPr>
+                <w:b/>
+                <w:bCs/>
+              </w:rPr>
+            </w:pPr>
+            <w:r>
+              <w:rPr>
+                <w:b/>
+                <w:bCs/>
+              </w:rPr>
+              <w:t>Pass</w:t>
+            </w:r>
+          </w:p>
         </w:tc>
       </w:tr>
       <w:tr>
@@ -2168,6 +2254,37 @@
               </w:rPr>
             </w:pPr>
           </w:p>
+          <w:p>
+            <w:pPr>
+              <w:rPr>
+                <w:b/>
+                <w:bCs/>
+              </w:rPr>
+            </w:pPr>
+          </w:p>
+          <w:p>
+            <w:pPr>
+              <w:rPr>
+                <w:b/>
+                <w:bCs/>
+              </w:rPr>
+            </w:pPr>
+          </w:p>
+          <w:p>
+            <w:pPr>
+              <w:rPr>
+                <w:b/>
+                <w:bCs/>
+              </w:rPr>
+            </w:pPr>
+            <w:r>
+              <w:rPr>
+                <w:b/>
+                <w:bCs/>
+              </w:rPr>
+              <w:t>Pass</w:t>
+            </w:r>
+          </w:p>
         </w:tc>
       </w:tr>
       <w:tr>
@@ -2382,15 +2499,7 @@
               <w:pStyle w:val="ListParagraph"/>
             </w:pPr>
             <w:r>
-              <w:t>(</w:t>
-            </w:r>
-            <w:proofErr w:type="gramStart"/>
-            <w:r>
-              <w:t>replace</w:t>
-            </w:r>
-            <w:proofErr w:type="gramEnd"/>
-            <w:r>
-              <w:t xml:space="preserve"> the parameters by appropriate values). </w:t>
+              <w:t xml:space="preserve">(replace the parameters by appropriate values). </w:t>
             </w:r>
           </w:p>
           <w:p>

</xml_diff>

<commit_message>
Final tests, final commit
</commit_message>
<xml_diff>
--- a/Test Cases.docx
+++ b/Test Cases.docx
@@ -2405,6 +2405,37 @@
               </w:rPr>
             </w:pPr>
           </w:p>
+          <w:p>
+            <w:pPr>
+              <w:rPr>
+                <w:b/>
+                <w:bCs/>
+              </w:rPr>
+            </w:pPr>
+          </w:p>
+          <w:p>
+            <w:pPr>
+              <w:rPr>
+                <w:b/>
+                <w:bCs/>
+              </w:rPr>
+            </w:pPr>
+          </w:p>
+          <w:p>
+            <w:pPr>
+              <w:rPr>
+                <w:b/>
+                <w:bCs/>
+              </w:rPr>
+            </w:pPr>
+            <w:r>
+              <w:rPr>
+                <w:b/>
+                <w:bCs/>
+              </w:rPr>
+              <w:t>Pass</w:t>
+            </w:r>
+          </w:p>
         </w:tc>
       </w:tr>
       <w:tr>
@@ -2499,7 +2530,15 @@
               <w:pStyle w:val="ListParagraph"/>
             </w:pPr>
             <w:r>
-              <w:t xml:space="preserve">(replace the parameters by appropriate values). </w:t>
+              <w:t>(</w:t>
+            </w:r>
+            <w:proofErr w:type="gramStart"/>
+            <w:r>
+              <w:t>replace</w:t>
+            </w:r>
+            <w:proofErr w:type="gramEnd"/>
+            <w:r>
+              <w:t xml:space="preserve"> the parameters by appropriate values). </w:t>
             </w:r>
           </w:p>
           <w:p>
@@ -2531,6 +2570,37 @@
                 <w:bCs/>
               </w:rPr>
             </w:pPr>
+          </w:p>
+          <w:p>
+            <w:pPr>
+              <w:rPr>
+                <w:b/>
+                <w:bCs/>
+              </w:rPr>
+            </w:pPr>
+          </w:p>
+          <w:p>
+            <w:pPr>
+              <w:rPr>
+                <w:b/>
+                <w:bCs/>
+              </w:rPr>
+            </w:pPr>
+          </w:p>
+          <w:p>
+            <w:pPr>
+              <w:rPr>
+                <w:b/>
+                <w:bCs/>
+              </w:rPr>
+            </w:pPr>
+            <w:r>
+              <w:rPr>
+                <w:b/>
+                <w:bCs/>
+              </w:rPr>
+              <w:t>Pass</w:t>
+            </w:r>
           </w:p>
         </w:tc>
       </w:tr>

</xml_diff>